<commit_message>
final version for colloquium
</commit_message>
<xml_diff>
--- a/documents/Origin_ambiguity.docx
+++ b/documents/Origin_ambiguity.docx
@@ -374,7 +374,7 @@
     </w:p>
     <w:bookmarkEnd w:id="26"/>
     <w:bookmarkEnd w:id="27"/>
-    <w:bookmarkStart w:id="32" w:name="research-plan"/>
+    <w:bookmarkStart w:id="29" w:name="research-plan"/>
     <w:p>
       <w:pPr>
         <w:pStyle w:val="Heading1"/>
@@ -410,63 +410,12 @@
       <w:tr>
         <w:tc>
           <w:tcPr/>
-          <w:bookmarkStart w:id="31" w:name="fig-conceptual-model"/>
+          <w:bookmarkStart w:id="28" w:name="fig-conceptual-model"/>
           <w:p>
             <w:pPr>
               <w:pStyle w:val="Compact"/>
               <w:jc w:val="center"/>
             </w:pPr>
-            <w:r>
-              <w:drawing>
-                <wp:inline>
-                  <wp:extent cx="5334000" cy="1882944"/>
-                  <wp:effectExtent b="0" l="0" r="0" t="0"/>
-                  <wp:docPr descr="" title="" id="29" name="Picture"/>
-                  <a:graphic>
-                    <a:graphicData uri="http://schemas.openxmlformats.org/drawingml/2006/picture">
-                      <pic:pic>
-                        <pic:nvPicPr>
-                          <pic:cNvPr descr="conceptual_model.svg" id="30" name="Picture"/>
-                          <pic:cNvPicPr>
-                            <a:picLocks noChangeArrowheads="1" noChangeAspect="1"/>
-                          </pic:cNvPicPr>
-                        </pic:nvPicPr>
-                        <pic:blipFill>
-                          <a:blip>
-                            <a:extLst>
-                              <a:ext uri="{28A0092B-C50C-407E-A947-70E740481C1C}">
-                                <a14:useLocalDpi xmlns:a14="http://schemas.microsoft.com/office/drawing/2010/main" val="0"/>
-                              </a:ext>
-                              <a:ext uri="{96DAC541-7B7A-43D3-8B79-37D633B846F1}">
-                                <asvg:svgBlip xmlns:asvg="http://schemas.microsoft.com/office/drawing/2016/SVG/main" r:embed="rId28"/>
-                              </a:ext>
-                            </a:extLst>
-                          </a:blip>
-                          <a:stretch>
-                            <a:fillRect/>
-                          </a:stretch>
-                        </pic:blipFill>
-                        <pic:spPr bwMode="auto">
-                          <a:xfrm>
-                            <a:off x="0" y="0"/>
-                            <a:ext cx="5334000" cy="1882944"/>
-                          </a:xfrm>
-                          <a:prstGeom prst="rect">
-                            <a:avLst/>
-                          </a:prstGeom>
-                          <a:noFill/>
-                          <a:ln w="9525">
-                            <a:noFill/>
-                            <a:headEnd/>
-                            <a:tailEnd/>
-                          </a:ln>
-                        </pic:spPr>
-                      </pic:pic>
-                    </a:graphicData>
-                  </a:graphic>
-                </wp:inline>
-              </w:drawing>
-            </w:r>
           </w:p>
           <w:p>
             <w:pPr>
@@ -481,12 +430,12 @@
               <w:t xml:space="preserve">Figure 1: Conceptual Model</w:t>
             </w:r>
           </w:p>
-          <w:bookmarkEnd w:id="31"/>
+          <w:bookmarkEnd w:id="28"/>
         </w:tc>
       </w:tr>
     </w:tbl>
-    <w:bookmarkEnd w:id="32"/>
-    <w:bookmarkStart w:id="61" w:name="open-questions"/>
+    <w:bookmarkEnd w:id="29"/>
+    <w:bookmarkStart w:id="58" w:name="open-questions"/>
     <w:p>
       <w:pPr>
         <w:pStyle w:val="Heading1"/>
@@ -559,8 +508,8 @@
         <w:t xml:space="preserve">A second question to be discussed is whether or not to include the comparison of low origin-ambiguity materials that are clearly AI generated, or if it makes more sense to only compare against clearly human-generated material. (we’d probably need to do so at some point)</w:t>
       </w:r>
     </w:p>
-    <w:bookmarkStart w:id="60" w:name="refs"/>
-    <w:bookmarkStart w:id="33" w:name="X3e785ebb855ebbddcc2ccde2123026282db02c5"/>
+    <w:bookmarkStart w:id="57" w:name="refs"/>
+    <w:bookmarkStart w:id="30" w:name="X3e785ebb855ebbddcc2ccde2123026282db02c5"/>
     <w:p>
       <w:pPr>
         <w:pStyle w:val="Bibliography"/>
@@ -584,8 +533,8 @@
         <w:t xml:space="preserve">.”</w:t>
       </w:r>
     </w:p>
-    <w:bookmarkEnd w:id="33"/>
-    <w:bookmarkStart w:id="35" w:name="ref-hagtvedtImpactIncompleteTypeface2011"/>
+    <w:bookmarkEnd w:id="30"/>
+    <w:bookmarkStart w:id="32" w:name="ref-hagtvedtImpactIncompleteTypeface2011"/>
     <w:p>
       <w:pPr>
         <w:pStyle w:val="Bibliography"/>
@@ -663,7 +612,7 @@
       <w:r>
         <w:t xml:space="preserve"> </w:t>
       </w:r>
-      <w:hyperlink r:id="rId34">
+      <w:hyperlink r:id="rId31">
         <w:r>
           <w:rPr>
             <w:rStyle w:val="Hyperlink"/>
@@ -675,8 +624,8 @@
         <w:t xml:space="preserve">.</w:t>
       </w:r>
     </w:p>
-    <w:bookmarkEnd w:id="35"/>
-    <w:bookmarkStart w:id="37" w:name="ref-hochConsumerLearningAdvertising1986"/>
+    <w:bookmarkEnd w:id="32"/>
+    <w:bookmarkStart w:id="34" w:name="ref-hochConsumerLearningAdvertising1986"/>
     <w:p>
       <w:pPr>
         <w:pStyle w:val="Bibliography"/>
@@ -751,7 +700,7 @@
       <w:r>
         <w:t xml:space="preserve"> </w:t>
       </w:r>
-      <w:hyperlink r:id="rId36">
+      <w:hyperlink r:id="rId33">
         <w:r>
           <w:rPr>
             <w:rStyle w:val="Hyperlink"/>
@@ -763,8 +712,8 @@
         <w:t xml:space="preserve">.</w:t>
       </w:r>
     </w:p>
-    <w:bookmarkEnd w:id="37"/>
-    <w:bookmarkStart w:id="39" w:name="Xe8c757d5920a596db4ab549badbfe91342723e8"/>
+    <w:bookmarkEnd w:id="34"/>
+    <w:bookmarkStart w:id="36" w:name="Xe8c757d5920a596db4ab549badbfe91342723e8"/>
     <w:p>
       <w:pPr>
         <w:pStyle w:val="Bibliography"/>
@@ -821,7 +770,7 @@
       <w:r>
         <w:t xml:space="preserve"> </w:t>
       </w:r>
-      <w:hyperlink r:id="rId38">
+      <w:hyperlink r:id="rId35">
         <w:r>
           <w:rPr>
             <w:rStyle w:val="Hyperlink"/>
@@ -833,8 +782,8 @@
         <w:t xml:space="preserve">.</w:t>
       </w:r>
     </w:p>
-    <w:bookmarkEnd w:id="39"/>
-    <w:bookmarkStart w:id="40" w:name="X8be185ab9b039370759c24bc59ee20ca8557f4f"/>
+    <w:bookmarkEnd w:id="36"/>
+    <w:bookmarkStart w:id="37" w:name="X8be185ab9b039370759c24bc59ee20ca8557f4f"/>
     <w:p>
       <w:pPr>
         <w:pStyle w:val="Bibliography"/>
@@ -895,8 +844,8 @@
         <w:t xml:space="preserve">.</w:t>
       </w:r>
     </w:p>
-    <w:bookmarkEnd w:id="40"/>
-    <w:bookmarkStart w:id="42" w:name="X4f84f3c1bffed53d4aaceb7ee072a9fb961e663"/>
+    <w:bookmarkEnd w:id="37"/>
+    <w:bookmarkStart w:id="39" w:name="X4f84f3c1bffed53d4aaceb7ee072a9fb961e663"/>
     <w:p>
       <w:pPr>
         <w:pStyle w:val="Bibliography"/>
@@ -941,7 +890,7 @@
       <w:r>
         <w:t xml:space="preserve"> </w:t>
       </w:r>
-      <w:hyperlink r:id="rId41">
+      <w:hyperlink r:id="rId38">
         <w:r>
           <w:rPr>
             <w:rStyle w:val="Hyperlink"/>
@@ -953,8 +902,8 @@
         <w:t xml:space="preserve">.</w:t>
       </w:r>
     </w:p>
-    <w:bookmarkEnd w:id="42"/>
-    <w:bookmarkStart w:id="44" w:name="ref-milickaHumansCanLearn2025"/>
+    <w:bookmarkEnd w:id="39"/>
+    <w:bookmarkStart w:id="41" w:name="ref-milickaHumansCanLearn2025"/>
     <w:p>
       <w:pPr>
         <w:pStyle w:val="Bibliography"/>
@@ -999,7 +948,7 @@
       <w:r>
         <w:t xml:space="preserve"> </w:t>
       </w:r>
-      <w:hyperlink r:id="rId43">
+      <w:hyperlink r:id="rId40">
         <w:r>
           <w:rPr>
             <w:rStyle w:val="Hyperlink"/>
@@ -1011,8 +960,8 @@
         <w:t xml:space="preserve">.</w:t>
       </w:r>
     </w:p>
-    <w:bookmarkEnd w:id="44"/>
-    <w:bookmarkStart w:id="46" w:name="ref-moriUncannyValleyField2012"/>
+    <w:bookmarkEnd w:id="41"/>
+    <w:bookmarkStart w:id="43" w:name="ref-moriUncannyValleyField2012"/>
     <w:p>
       <w:pPr>
         <w:pStyle w:val="Bibliography"/>
@@ -1075,7 +1024,7 @@
       <w:r>
         <w:t xml:space="preserve"> </w:t>
       </w:r>
-      <w:hyperlink r:id="rId45">
+      <w:hyperlink r:id="rId42">
         <w:r>
           <w:rPr>
             <w:rStyle w:val="Hyperlink"/>
@@ -1087,8 +1036,8 @@
         <w:t xml:space="preserve">.</w:t>
       </w:r>
     </w:p>
-    <w:bookmarkEnd w:id="46"/>
-    <w:bookmarkStart w:id="48" w:name="X2c7e3457ceebb7e0037ba6b501c3d6459886eef"/>
+    <w:bookmarkEnd w:id="43"/>
+    <w:bookmarkStart w:id="45" w:name="X2c7e3457ceebb7e0037ba6b501c3d6459886eef"/>
     <w:p>
       <w:pPr>
         <w:pStyle w:val="Bibliography"/>
@@ -1154,7 +1103,7 @@
       <w:r>
         <w:t xml:space="preserve"> </w:t>
       </w:r>
-      <w:hyperlink r:id="rId47">
+      <w:hyperlink r:id="rId44">
         <w:r>
           <w:rPr>
             <w:rStyle w:val="Hyperlink"/>
@@ -1166,8 +1115,8 @@
         <w:t xml:space="preserve">.</w:t>
       </w:r>
     </w:p>
-    <w:bookmarkEnd w:id="48"/>
-    <w:bookmarkStart w:id="50" w:name="ref-peracchioHowAmbiguousCropped1994"/>
+    <w:bookmarkEnd w:id="45"/>
+    <w:bookmarkStart w:id="47" w:name="ref-peracchioHowAmbiguousCropped1994"/>
     <w:p>
       <w:pPr>
         <w:pStyle w:val="Bibliography"/>
@@ -1233,7 +1182,7 @@
       <w:r>
         <w:t xml:space="preserve"> </w:t>
       </w:r>
-      <w:hyperlink r:id="rId49">
+      <w:hyperlink r:id="rId46">
         <w:r>
           <w:rPr>
             <w:rStyle w:val="Hyperlink"/>
@@ -1245,8 +1194,8 @@
         <w:t xml:space="preserve">.</w:t>
       </w:r>
     </w:p>
-    <w:bookmarkEnd w:id="50"/>
-    <w:bookmarkStart w:id="52" w:name="Xaf3226c9478161af886585bacea96e360b18a49"/>
+    <w:bookmarkEnd w:id="47"/>
+    <w:bookmarkStart w:id="49" w:name="Xaf3226c9478161af886585bacea96e360b18a49"/>
     <w:p>
       <w:pPr>
         <w:pStyle w:val="Bibliography"/>
@@ -1288,7 +1237,7 @@
       <w:r>
         <w:t xml:space="preserve"> </w:t>
       </w:r>
-      <w:hyperlink r:id="rId51">
+      <w:hyperlink r:id="rId48">
         <w:r>
           <w:rPr>
             <w:rStyle w:val="Hyperlink"/>
@@ -1300,8 +1249,8 @@
         <w:t xml:space="preserve">.</w:t>
       </w:r>
     </w:p>
-    <w:bookmarkEnd w:id="52"/>
-    <w:bookmarkStart w:id="54" w:name="ref-shinUncannyValleyNo2019"/>
+    <w:bookmarkEnd w:id="49"/>
+    <w:bookmarkStart w:id="51" w:name="ref-shinUncannyValleyNo2019"/>
     <w:p>
       <w:pPr>
         <w:pStyle w:val="Bibliography"/>
@@ -1346,7 +1295,7 @@
       <w:r>
         <w:t xml:space="preserve"> </w:t>
       </w:r>
-      <w:hyperlink r:id="rId53">
+      <w:hyperlink r:id="rId50">
         <w:r>
           <w:rPr>
             <w:rStyle w:val="Hyperlink"/>
@@ -1358,8 +1307,8 @@
         <w:t xml:space="preserve">.</w:t>
       </w:r>
     </w:p>
-    <w:bookmarkEnd w:id="54"/>
-    <w:bookmarkStart w:id="56" w:name="Xeab4481eafa53fd578408e4aae6417321c44db9"/>
+    <w:bookmarkEnd w:id="51"/>
+    <w:bookmarkStart w:id="53" w:name="Xeab4481eafa53fd578408e4aae6417321c44db9"/>
     <w:p>
       <w:pPr>
         <w:pStyle w:val="Bibliography"/>
@@ -1434,7 +1383,7 @@
       <w:r>
         <w:t xml:space="preserve"> </w:t>
       </w:r>
-      <w:hyperlink r:id="rId55">
+      <w:hyperlink r:id="rId52">
         <w:r>
           <w:rPr>
             <w:rStyle w:val="Hyperlink"/>
@@ -1446,8 +1395,8 @@
         <w:t xml:space="preserve">.</w:t>
       </w:r>
     </w:p>
-    <w:bookmarkEnd w:id="56"/>
-    <w:bookmarkStart w:id="58" w:name="ref-vukojicicImitationDrawingCan2023"/>
+    <w:bookmarkEnd w:id="53"/>
+    <w:bookmarkStart w:id="55" w:name="ref-vukojicicImitationDrawingCan2023"/>
     <w:p>
       <w:pPr>
         <w:pStyle w:val="Bibliography"/>
@@ -1578,7 +1527,7 @@
       <w:r>
         <w:t xml:space="preserve"> </w:t>
       </w:r>
-      <w:hyperlink r:id="rId57">
+      <w:hyperlink r:id="rId54">
         <w:r>
           <w:rPr>
             <w:rStyle w:val="Hyperlink"/>
@@ -1590,8 +1539,8 @@
         <w:t xml:space="preserve">.</w:t>
       </w:r>
     </w:p>
-    <w:bookmarkEnd w:id="58"/>
-    <w:bookmarkStart w:id="59" w:name="Xc6c577270cf1fb17121d5c242f24e1bede46eaf"/>
+    <w:bookmarkEnd w:id="55"/>
+    <w:bookmarkStart w:id="56" w:name="Xc6c577270cf1fb17121d5c242f24e1bede46eaf"/>
     <w:p>
       <w:pPr>
         <w:pStyle w:val="Bibliography"/>
@@ -1664,9 +1613,9 @@
         <w:t xml:space="preserve">20: 502–8.</w:t>
       </w:r>
     </w:p>
-    <w:bookmarkEnd w:id="59"/>
-    <w:bookmarkEnd w:id="60"/>
-    <w:bookmarkEnd w:id="61"/>
+    <w:bookmarkEnd w:id="56"/>
+    <w:bookmarkEnd w:id="57"/>
+    <w:bookmarkEnd w:id="58"/>
     <w:sectPr>
       <w:footnotePr>
         <w:numRestart w:val="eachSect"/>

</xml_diff>